<commit_message>
done with the exam-style-questions
</commit_message>
<xml_diff>
--- a/3. Hardware/Exam-style-Questions.docx
+++ b/3. Hardware/Exam-style-Questions.docx
@@ -1,6 +1,6 @@
 
 <file path=word/document.xml><?xml version="1.0" encoding="utf-8"?>
-<w:document xmlns:wpc="http://schemas.microsoft.com/office/word/2010/wordprocessingCanvas" xmlns:cx="http://schemas.microsoft.com/office/drawing/2014/chartex" xmlns:cx1="http://schemas.microsoft.com/office/drawing/2015/9/8/chartex" xmlns:cx2="http://schemas.microsoft.com/office/drawing/2015/10/21/chartex" xmlns:cx3="http://schemas.microsoft.com/office/drawing/2016/5/9/chartex" xmlns:cx4="http://schemas.microsoft.com/office/drawing/2016/5/10/chartex" xmlns:cx5="http://schemas.microsoft.com/office/drawing/2016/5/11/chartex" xmlns:cx6="http://schemas.microsoft.com/office/drawing/2016/5/12/chartex" xmlns:cx7="http://schemas.microsoft.com/office/drawing/2016/5/13/chartex" xmlns:cx8="http://schemas.microsoft.com/office/drawing/2016/5/14/chartex" xmlns:mc="http://schemas.openxmlformats.org/markup-compatibility/2006" xmlns:aink="http://schemas.microsoft.com/office/drawing/2016/ink" xmlns:am3d="http://schemas.microsoft.com/office/drawing/2017/model3d" xmlns:o="urn:schemas-microsoft-com:office:office" xmlns:oel="http://schemas.microsoft.com/office/2019/extlst" xmlns:r="http://schemas.openxmlformats.org/officeDocument/2006/relationships" xmlns:m="http://schemas.openxmlformats.org/officeDocument/2006/math" xmlns:v="urn:schemas-microsoft-com:vml" xmlns:wp14="http://schemas.microsoft.com/office/word/2010/wordprocessingDrawing" xmlns:wp="http://schemas.openxmlformats.org/drawingml/2006/wordprocessingDrawing" xmlns:w10="urn:schemas-microsoft-com:office:word" xmlns:w="http://schemas.openxmlformats.org/wordprocessingml/2006/main" xmlns:w14="http://schemas.microsoft.com/office/word/2010/wordml" xmlns:w15="http://schemas.microsoft.com/office/word/2012/wordml" xmlns:w16cex="http://schemas.microsoft.com/office/word/2018/wordml/cex" xmlns:w16cid="http://schemas.microsoft.com/office/word/2016/wordml/cid" xmlns:w16="http://schemas.microsoft.com/office/word/2018/wordml" xmlns:w16du="http://schemas.microsoft.com/office/word/2023/wordml/word16du" xmlns:w16sdtdh="http://schemas.microsoft.com/office/word/2020/wordml/sdtdatahash" xmlns:w16sdtfl="http://schemas.microsoft.com/office/word/2024/wordml/sdtformatlock" xmlns:w16se="http://schemas.microsoft.com/office/word/2015/wordml/symex" xmlns:wpg="http://schemas.microsoft.com/office/word/2010/wordprocessingGroup" xmlns:wpi="http://schemas.microsoft.com/office/word/2010/wordprocessingInk" xmlns:wne="http://schemas.microsoft.com/office/word/2006/wordml" xmlns:wps="http://schemas.microsoft.com/office/word/2010/wordprocessingShape" mc:Ignorable="w14 w15 w16se w16cid w16 w16cex w16sdtdh w16sdtfl w16du wp14">
+<w:document xmlns:wpc="http://schemas.microsoft.com/office/word/2010/wordprocessingCanvas" xmlns:cx="http://schemas.microsoft.com/office/drawing/2014/chartex" xmlns:cx1="http://schemas.microsoft.com/office/drawing/2015/9/8/chartex" xmlns:cx2="http://schemas.microsoft.com/office/drawing/2015/10/21/chartex" xmlns:cx3="http://schemas.microsoft.com/office/drawing/2016/5/9/chartex" xmlns:cx4="http://schemas.microsoft.com/office/drawing/2016/5/10/chartex" xmlns:cx5="http://schemas.microsoft.com/office/drawing/2016/5/11/chartex" xmlns:cx6="http://schemas.microsoft.com/office/drawing/2016/5/12/chartex" xmlns:cx7="http://schemas.microsoft.com/office/drawing/2016/5/13/chartex" xmlns:cx8="http://schemas.microsoft.com/office/drawing/2016/5/14/chartex" xmlns:mc="http://schemas.openxmlformats.org/markup-compatibility/2006" xmlns:aink="http://schemas.microsoft.com/office/drawing/2016/ink" xmlns:am3d="http://schemas.microsoft.com/office/drawing/2017/model3d" xmlns:o="urn:schemas-microsoft-com:office:office" xmlns:oel="http://schemas.microsoft.com/office/2019/extlst" xmlns:r="http://schemas.openxmlformats.org/officeDocument/2006/relationships" xmlns:m="http://schemas.openxmlformats.org/officeDocument/2006/math" xmlns:v="urn:schemas-microsoft-com:vml" xmlns:wp14="http://schemas.microsoft.com/office/word/2010/wordprocessingDrawing" xmlns:wp="http://schemas.openxmlformats.org/drawingml/2006/wordprocessingDrawing" xmlns:w10="urn:schemas-microsoft-com:office:word" xmlns:w="http://schemas.openxmlformats.org/wordprocessingml/2006/main" xmlns:w14="http://schemas.microsoft.com/office/word/2010/wordml" xmlns:w15="http://schemas.microsoft.com/office/word/2012/wordml" xmlns:w16cei="http://schemas.microsoft.com/office/word/2026/wordml/cei" xmlns:w16cex="http://schemas.microsoft.com/office/word/2018/wordml/cex" xmlns:w16cid="http://schemas.microsoft.com/office/word/2016/wordml/cid" xmlns:w16="http://schemas.microsoft.com/office/word/2018/wordml" xmlns:w16du="http://schemas.microsoft.com/office/word/2023/wordml/word16du" xmlns:w16sdtdh="http://schemas.microsoft.com/office/word/2020/wordml/sdtdatahash" xmlns:w16sdtfl="http://schemas.microsoft.com/office/word/2024/wordml/sdtformatlock" xmlns:w16se="http://schemas.microsoft.com/office/word/2015/wordml/symex" xmlns:wpg="http://schemas.microsoft.com/office/word/2010/wordprocessingGroup" xmlns:wpi="http://schemas.microsoft.com/office/word/2010/wordprocessingInk" xmlns:wne="http://schemas.microsoft.com/office/word/2006/wordml" xmlns:wps="http://schemas.microsoft.com/office/word/2010/wordprocessingShape" mc:Ignorable="w14 w15 w16se w16cid w16 w16cex w16sdtdh w16sdtfl w16du wp14">
   <w:body>
     <w:p>
       <w:pPr>
@@ -19,21 +19,7 @@
           <w:sz w:val="24"/>
           <w:szCs w:val="24"/>
         </w:rPr>
-        <w:t xml:space="preserve"> A student has a computer that has a Von Neumann architecture.</w:t>
-      </w:r>
-      <w:r>
-        <w:rPr>
-          <w:sz w:val="24"/>
-          <w:szCs w:val="24"/>
-        </w:rPr>
-        <w:t xml:space="preserve"> </w:t>
-      </w:r>
-      <w:r>
-        <w:rPr>
-          <w:sz w:val="24"/>
-          <w:szCs w:val="24"/>
-        </w:rPr>
-        <w:t>The CPU in the computer performs the fetch-decode-execute cycle to process data and instructions.</w:t>
+        <w:t xml:space="preserve"> A student has a computer that has a Von Neumann architecture. The CPU in the computer performs the fetch-decode-execute cycle to process data and instructions.</w:t>
       </w:r>
     </w:p>
     <w:p>
@@ -72,6 +58,40 @@
     <w:p>
       <w:pPr>
         <w:pStyle w:val="ListParagraph"/>
+        <w:ind w:left="1440"/>
+        <w:rPr>
+          <w:sz w:val="24"/>
+          <w:szCs w:val="24"/>
+        </w:rPr>
+      </w:pPr>
+      <w:r>
+        <w:rPr>
+          <w:sz w:val="24"/>
+          <w:szCs w:val="24"/>
+        </w:rPr>
+        <w:t>Answer: The instruction is stored in “Memory Address Register (MAR)” immediately before it is fetched.</w:t>
+      </w:r>
+    </w:p>
+    <w:p>
+      <w:pPr>
+        <w:pStyle w:val="ListParagraph"/>
+        <w:ind w:left="1440"/>
+        <w:rPr>
+          <w:sz w:val="24"/>
+          <w:szCs w:val="24"/>
+        </w:rPr>
+      </w:pPr>
+      <w:r>
+        <w:rPr>
+          <w:sz w:val="24"/>
+          <w:szCs w:val="24"/>
+        </w:rPr>
+        <w:t xml:space="preserve"> </w:t>
+      </w:r>
+    </w:p>
+    <w:p>
+      <w:pPr>
+        <w:pStyle w:val="ListParagraph"/>
         <w:numPr>
           <w:ilvl w:val="1"/>
           <w:numId w:val="1"/>
@@ -92,6 +112,40 @@
     <w:p>
       <w:pPr>
         <w:pStyle w:val="ListParagraph"/>
+        <w:ind w:left="1440"/>
+        <w:rPr>
+          <w:sz w:val="24"/>
+          <w:szCs w:val="24"/>
+        </w:rPr>
+      </w:pPr>
+      <w:r>
+        <w:rPr>
+          <w:sz w:val="24"/>
+          <w:szCs w:val="24"/>
+        </w:rPr>
+        <w:t xml:space="preserve">Answer: </w:t>
+      </w:r>
+      <w:r>
+        <w:rPr>
+          <w:sz w:val="24"/>
+          <w:szCs w:val="24"/>
+        </w:rPr>
+        <w:t xml:space="preserve">The Program counter stores the address of the next instruction that will be processed. </w:t>
+      </w:r>
+    </w:p>
+    <w:p>
+      <w:pPr>
+        <w:pStyle w:val="ListParagraph"/>
+        <w:ind w:left="1440"/>
+        <w:rPr>
+          <w:sz w:val="24"/>
+          <w:szCs w:val="24"/>
+        </w:rPr>
+      </w:pPr>
+    </w:p>
+    <w:p>
+      <w:pPr>
+        <w:pStyle w:val="ListParagraph"/>
         <w:numPr>
           <w:ilvl w:val="1"/>
           <w:numId w:val="1"/>
@@ -111,6 +165,32 @@
     </w:p>
     <w:p>
       <w:pPr>
+        <w:pStyle w:val="ListParagraph"/>
+        <w:ind w:left="1440"/>
+        <w:rPr>
+          <w:sz w:val="24"/>
+          <w:szCs w:val="24"/>
+        </w:rPr>
+      </w:pPr>
+      <w:r>
+        <w:rPr>
+          <w:sz w:val="24"/>
+          <w:szCs w:val="24"/>
+        </w:rPr>
+        <w:t xml:space="preserve">Answer: In the decode stage of the fetch-decode-execute cycle, the instruction is being read by the CPU and ready to be execute. </w:t>
+      </w:r>
+    </w:p>
+    <w:p>
+      <w:pPr>
+        <w:ind w:left="720" w:firstLine="720"/>
+        <w:rPr>
+          <w:sz w:val="24"/>
+          <w:szCs w:val="24"/>
+        </w:rPr>
+      </w:pPr>
+    </w:p>
+    <w:p>
+      <w:pPr>
         <w:ind w:left="1080"/>
         <w:rPr>
           <w:sz w:val="24"/>
@@ -135,23 +215,7 @@
           <w:sz w:val="24"/>
           <w:szCs w:val="24"/>
         </w:rPr>
-        <w:t xml:space="preserve"> The computer has a 2 GHz single core processor. The students </w:t>
-      </w:r>
-      <w:proofErr w:type="gramStart"/>
-      <w:r>
-        <w:rPr>
-          <w:sz w:val="24"/>
-          <w:szCs w:val="24"/>
-        </w:rPr>
-        <w:t>wants</w:t>
-      </w:r>
-      <w:proofErr w:type="gramEnd"/>
-      <w:r>
-        <w:rPr>
-          <w:sz w:val="24"/>
-          <w:szCs w:val="24"/>
-        </w:rPr>
-        <w:t xml:space="preserve"> to improve the performance of the computer by replacing the CPU.</w:t>
+        <w:t xml:space="preserve"> The computer has a 2 GHz single core processor. The student wants to improve the performance of the computer by replacing the CPU.</w:t>
       </w:r>
     </w:p>
     <w:p>
@@ -192,6 +256,22 @@
     <w:p>
       <w:pPr>
         <w:pStyle w:val="ListParagraph"/>
+        <w:rPr>
+          <w:sz w:val="24"/>
+          <w:szCs w:val="24"/>
+        </w:rPr>
+      </w:pPr>
+      <w:r>
+        <w:rPr>
+          <w:sz w:val="24"/>
+          <w:szCs w:val="24"/>
+        </w:rPr>
+        <w:t>Answer: the CPU has two cores.</w:t>
+      </w:r>
+    </w:p>
+    <w:p>
+      <w:pPr>
+        <w:pStyle w:val="ListParagraph"/>
         <w:numPr>
           <w:ilvl w:val="0"/>
           <w:numId w:val="6"/>
@@ -211,6 +291,40 @@
     </w:p>
     <w:p>
       <w:pPr>
+        <w:pStyle w:val="ListParagraph"/>
+        <w:ind w:left="1080"/>
+        <w:rPr>
+          <w:sz w:val="24"/>
+          <w:szCs w:val="24"/>
+        </w:rPr>
+      </w:pPr>
+      <w:r>
+        <w:rPr>
+          <w:sz w:val="24"/>
+          <w:szCs w:val="24"/>
+        </w:rPr>
+        <w:t xml:space="preserve">Answer: The performance of the CPU would be better because the new CPU has two </w:t>
+      </w:r>
+      <w:proofErr w:type="gramStart"/>
+      <w:r>
+        <w:rPr>
+          <w:sz w:val="24"/>
+          <w:szCs w:val="24"/>
+        </w:rPr>
+        <w:t>core</w:t>
+      </w:r>
+      <w:proofErr w:type="gramEnd"/>
+      <w:r>
+        <w:rPr>
+          <w:sz w:val="24"/>
+          <w:szCs w:val="24"/>
+        </w:rPr>
+        <w:t xml:space="preserve"> of 3.4 GHz which will perform more instruction than the old one.</w:t>
+      </w:r>
+    </w:p>
+    <w:p>
+      <w:pPr>
+        <w:ind w:left="360"/>
         <w:rPr>
           <w:sz w:val="24"/>
           <w:szCs w:val="24"/>
@@ -239,38 +353,56 @@
     </w:p>
     <w:p>
       <w:pPr>
+        <w:pStyle w:val="ListParagraph"/>
+        <w:numPr>
+          <w:ilvl w:val="1"/>
+          <w:numId w:val="1"/>
+        </w:numPr>
         <w:ind w:firstLine="360"/>
         <w:rPr>
           <w:sz w:val="24"/>
           <w:szCs w:val="24"/>
         </w:rPr>
       </w:pPr>
-      <w:proofErr w:type="spellStart"/>
-      <w:r>
-        <w:rPr>
-          <w:sz w:val="24"/>
-          <w:szCs w:val="24"/>
-        </w:rPr>
-        <w:t>i</w:t>
-      </w:r>
-      <w:proofErr w:type="spellEnd"/>
-      <w:r>
-        <w:rPr>
-          <w:sz w:val="24"/>
-          <w:szCs w:val="24"/>
-        </w:rPr>
-        <w:t>.</w:t>
-      </w:r>
-      <w:r>
-        <w:rPr>
-          <w:sz w:val="24"/>
-          <w:szCs w:val="24"/>
-        </w:rPr>
-        <w:t xml:space="preserve"> Identify if these are examples of primary or secondary storage.</w:t>
-      </w:r>
-    </w:p>
-    <w:p>
-      <w:pPr>
+      <w:r>
+        <w:rPr>
+          <w:sz w:val="24"/>
+          <w:szCs w:val="24"/>
+        </w:rPr>
+        <w:t>Identify if these are examples of primary or secondary storage.</w:t>
+      </w:r>
+    </w:p>
+    <w:p>
+      <w:pPr>
+        <w:pStyle w:val="ListParagraph"/>
+        <w:ind w:left="2160"/>
+        <w:rPr>
+          <w:sz w:val="24"/>
+          <w:szCs w:val="24"/>
+        </w:rPr>
+      </w:pPr>
+      <w:r>
+        <w:rPr>
+          <w:sz w:val="24"/>
+          <w:szCs w:val="24"/>
+        </w:rPr>
+        <w:t xml:space="preserve">Answer: </w:t>
+      </w:r>
+      <w:r>
+        <w:rPr>
+          <w:sz w:val="24"/>
+          <w:szCs w:val="24"/>
+        </w:rPr>
+        <w:t xml:space="preserve">both are primary memories. </w:t>
+      </w:r>
+    </w:p>
+    <w:p>
+      <w:pPr>
+        <w:pStyle w:val="ListParagraph"/>
+        <w:numPr>
+          <w:ilvl w:val="1"/>
+          <w:numId w:val="1"/>
+        </w:numPr>
         <w:ind w:firstLine="360"/>
         <w:rPr>
           <w:sz w:val="24"/>
@@ -282,32 +414,51 @@
           <w:sz w:val="24"/>
           <w:szCs w:val="24"/>
         </w:rPr>
-        <w:t>i</w:t>
-      </w:r>
-      <w:r>
-        <w:rPr>
-          <w:sz w:val="24"/>
-          <w:szCs w:val="24"/>
-        </w:rPr>
-        <w:t>i</w:t>
-      </w:r>
-      <w:r>
-        <w:rPr>
-          <w:sz w:val="24"/>
-          <w:szCs w:val="24"/>
-        </w:rPr>
-        <w:t>.</w:t>
-      </w:r>
-      <w:r>
-        <w:rPr>
-          <w:sz w:val="24"/>
-          <w:szCs w:val="24"/>
-        </w:rPr>
-        <w:t xml:space="preserve"> State what each of these components store.</w:t>
-      </w:r>
-    </w:p>
-    <w:p>
-      <w:pPr>
+        <w:t xml:space="preserve"> State what each of these </w:t>
+      </w:r>
+      <w:r>
+        <w:rPr>
+          <w:sz w:val="24"/>
+          <w:szCs w:val="24"/>
+        </w:rPr>
+        <w:t>component’s</w:t>
+      </w:r>
+      <w:r>
+        <w:rPr>
+          <w:sz w:val="24"/>
+          <w:szCs w:val="24"/>
+        </w:rPr>
+        <w:t xml:space="preserve"> store.</w:t>
+      </w:r>
+    </w:p>
+    <w:p>
+      <w:pPr>
+        <w:pStyle w:val="ListParagraph"/>
+        <w:ind w:left="2160"/>
+        <w:rPr>
+          <w:sz w:val="24"/>
+          <w:szCs w:val="24"/>
+        </w:rPr>
+      </w:pPr>
+      <w:r>
+        <w:rPr>
+          <w:sz w:val="24"/>
+          <w:szCs w:val="24"/>
+        </w:rPr>
+        <w:t xml:space="preserve">Answer: The RAM stored the currently executing file and data that is required by the CPU for the processing while the ROM store the firmware </w:t>
+      </w:r>
+      <w:r>
+        <w:rPr>
+          <w:sz w:val="24"/>
+          <w:szCs w:val="24"/>
+        </w:rPr>
+        <w:lastRenderedPageBreak/>
+        <w:t xml:space="preserve">and the bootloader. The RAM lose its data when the power is off while the data of the ROM is stored permanently of it. </w:t>
+      </w:r>
+    </w:p>
+    <w:p>
+      <w:pPr>
+        <w:ind w:left="360"/>
         <w:rPr>
           <w:sz w:val="24"/>
           <w:szCs w:val="24"/>
@@ -339,14 +490,7 @@
           <w:sz w:val="24"/>
           <w:szCs w:val="24"/>
         </w:rPr>
-        <w:t xml:space="preserve"> </w:t>
-      </w:r>
-      <w:r>
-        <w:rPr>
-          <w:sz w:val="24"/>
-          <w:szCs w:val="24"/>
-        </w:rPr>
-        <w:t xml:space="preserve"> Give the most appropriate sensor for use in each of the given scenarios. A different sensor must be given for each scenario.</w:t>
+        <w:t xml:space="preserve">  Give the most appropriate sensor for use in each of the given scenarios. A different sensor must be given for each scenario.</w:t>
       </w:r>
     </w:p>
     <w:tbl>
@@ -433,6 +577,13 @@
                 <w:szCs w:val="24"/>
               </w:rPr>
             </w:pPr>
+            <w:r>
+              <w:rPr>
+                <w:sz w:val="24"/>
+                <w:szCs w:val="24"/>
+              </w:rPr>
+              <w:t>pH</w:t>
+            </w:r>
           </w:p>
         </w:tc>
       </w:tr>
@@ -476,6 +627,13 @@
                 <w:szCs w:val="24"/>
               </w:rPr>
             </w:pPr>
+            <w:r>
+              <w:rPr>
+                <w:sz w:val="24"/>
+                <w:szCs w:val="24"/>
+              </w:rPr>
+              <w:t>Infra-red</w:t>
+            </w:r>
           </w:p>
           <w:p>
             <w:pPr>
@@ -526,6 +684,13 @@
                 <w:szCs w:val="24"/>
               </w:rPr>
             </w:pPr>
+            <w:r>
+              <w:rPr>
+                <w:sz w:val="24"/>
+                <w:szCs w:val="24"/>
+              </w:rPr>
+              <w:t>Motion or Pressure</w:t>
+            </w:r>
           </w:p>
         </w:tc>
       </w:tr>
@@ -625,6 +790,23 @@
     <w:p>
       <w:pPr>
         <w:pStyle w:val="ListParagraph"/>
+        <w:ind w:left="1080"/>
+        <w:rPr>
+          <w:sz w:val="24"/>
+          <w:szCs w:val="24"/>
+        </w:rPr>
+      </w:pPr>
+      <w:r>
+        <w:rPr>
+          <w:sz w:val="24"/>
+          <w:szCs w:val="24"/>
+        </w:rPr>
+        <w:t>Answer: Digital Versatile Disc (DVD) and Compact Disc (CD)</w:t>
+      </w:r>
+    </w:p>
+    <w:p>
+      <w:pPr>
+        <w:pStyle w:val="ListParagraph"/>
         <w:numPr>
           <w:ilvl w:val="0"/>
           <w:numId w:val="9"/>
@@ -651,6 +833,30 @@
     </w:p>
     <w:p>
       <w:pPr>
+        <w:pStyle w:val="ListParagraph"/>
+        <w:ind w:left="1080"/>
+        <w:rPr>
+          <w:sz w:val="24"/>
+          <w:szCs w:val="24"/>
+        </w:rPr>
+      </w:pPr>
+      <w:r>
+        <w:rPr>
+          <w:sz w:val="24"/>
+          <w:szCs w:val="24"/>
+        </w:rPr>
+        <w:t xml:space="preserve">Answer: data is store on optical storage </w:t>
+      </w:r>
+      <w:r>
+        <w:rPr>
+          <w:sz w:val="24"/>
+          <w:szCs w:val="24"/>
+        </w:rPr>
+        <w:t>using laser light. It works by encoding data into a spiral track of tiny bumps called pits and flat areas called lands. A drive shines a laser at the spinning disc to read these patterns based on how light bounces back</w:t>
+      </w:r>
+    </w:p>
+    <w:p>
+      <w:pPr>
         <w:rPr>
           <w:sz w:val="24"/>
           <w:szCs w:val="24"/>
@@ -679,14 +885,6 @@
     </w:p>
     <w:p>
       <w:pPr>
-        <w:rPr>
-          <w:sz w:val="24"/>
-          <w:szCs w:val="24"/>
-        </w:rPr>
-      </w:pPr>
-    </w:p>
-    <w:p>
-      <w:pPr>
         <w:pStyle w:val="ListParagraph"/>
         <w:numPr>
           <w:ilvl w:val="0"/>
@@ -708,6 +906,39 @@
     <w:p>
       <w:pPr>
         <w:pStyle w:val="ListParagraph"/>
+        <w:ind w:left="1080"/>
+        <w:rPr>
+          <w:sz w:val="24"/>
+          <w:szCs w:val="24"/>
+        </w:rPr>
+      </w:pPr>
+      <w:r>
+        <w:rPr>
+          <w:sz w:val="24"/>
+          <w:szCs w:val="24"/>
+        </w:rPr>
+        <w:t xml:space="preserve">Answer: the company will not have to buy its own huge amount of storage instead it can </w:t>
+      </w:r>
+      <w:proofErr w:type="gramStart"/>
+      <w:r>
+        <w:rPr>
+          <w:sz w:val="24"/>
+          <w:szCs w:val="24"/>
+        </w:rPr>
+        <w:t>stores</w:t>
+      </w:r>
+      <w:proofErr w:type="gramEnd"/>
+      <w:r>
+        <w:rPr>
+          <w:sz w:val="24"/>
+          <w:szCs w:val="24"/>
+        </w:rPr>
+        <w:t xml:space="preserve"> the data in cloud storage. </w:t>
+      </w:r>
+    </w:p>
+    <w:p>
+      <w:pPr>
+        <w:pStyle w:val="ListParagraph"/>
         <w:numPr>
           <w:ilvl w:val="0"/>
           <w:numId w:val="10"/>
@@ -722,7 +953,48 @@
           <w:sz w:val="24"/>
           <w:szCs w:val="24"/>
         </w:rPr>
+        <w:lastRenderedPageBreak/>
         <w:t xml:space="preserve"> Give two disadvantages of storing the customer data in cloud storage, rather than local storage.</w:t>
+      </w:r>
+    </w:p>
+    <w:p>
+      <w:pPr>
+        <w:pStyle w:val="ListParagraph"/>
+        <w:numPr>
+          <w:ilvl w:val="1"/>
+          <w:numId w:val="10"/>
+        </w:numPr>
+        <w:rPr>
+          <w:sz w:val="24"/>
+          <w:szCs w:val="24"/>
+        </w:rPr>
+      </w:pPr>
+      <w:r>
+        <w:rPr>
+          <w:sz w:val="24"/>
+          <w:szCs w:val="24"/>
+        </w:rPr>
+        <w:t>Company will need to download and upload every single file which may delay in work.</w:t>
+      </w:r>
+    </w:p>
+    <w:p>
+      <w:pPr>
+        <w:pStyle w:val="ListParagraph"/>
+        <w:numPr>
+          <w:ilvl w:val="1"/>
+          <w:numId w:val="10"/>
+        </w:numPr>
+        <w:rPr>
+          <w:sz w:val="24"/>
+          <w:szCs w:val="24"/>
+        </w:rPr>
+      </w:pPr>
+      <w:r>
+        <w:rPr>
+          <w:sz w:val="24"/>
+          <w:szCs w:val="24"/>
+        </w:rPr>
+        <w:t>The cloud services are too costly</w:t>
       </w:r>
     </w:p>
     <w:p>
@@ -758,28 +1030,7 @@
           <w:sz w:val="24"/>
           <w:szCs w:val="24"/>
         </w:rPr>
-        <w:t xml:space="preserve"> A computer connects to the internet and is assigned an IP address.</w:t>
-      </w:r>
-      <w:r>
-        <w:rPr>
-          <w:sz w:val="24"/>
-          <w:szCs w:val="24"/>
-        </w:rPr>
-        <w:t xml:space="preserve"> </w:t>
-      </w:r>
-      <w:r>
-        <w:rPr>
-          <w:sz w:val="24"/>
-          <w:szCs w:val="24"/>
-        </w:rPr>
-        <w:t>The IP address has an IPv4 structure.</w:t>
-      </w:r>
-      <w:r>
-        <w:rPr>
-          <w:sz w:val="24"/>
-          <w:szCs w:val="24"/>
-        </w:rPr>
-        <w:t xml:space="preserve"> </w:t>
+        <w:t xml:space="preserve"> A computer connects to the internet and is assigned an IP address. The IP address has an IPv4 structure. </w:t>
       </w:r>
     </w:p>
     <w:p>
@@ -795,6 +1046,35 @@
           <w:szCs w:val="24"/>
         </w:rPr>
         <w:t>Describe the structure of an IPv4 address</w:t>
+      </w:r>
+      <w:r>
+        <w:rPr>
+          <w:sz w:val="24"/>
+          <w:szCs w:val="24"/>
+        </w:rPr>
+        <w:t>.</w:t>
+      </w:r>
+    </w:p>
+    <w:p>
+      <w:pPr>
+        <w:rPr>
+          <w:sz w:val="24"/>
+          <w:szCs w:val="24"/>
+        </w:rPr>
+      </w:pPr>
+      <w:r>
+        <w:rPr>
+          <w:sz w:val="24"/>
+          <w:szCs w:val="24"/>
+        </w:rPr>
+        <w:t xml:space="preserve">Answer: the IPv4 is 32 bits long internet protocol address, has four groups of 8 bits separated by a dot. Every group of IPv4 contain up to 4 numbers. For example, </w:t>
+      </w:r>
+      <w:r>
+        <w:rPr>
+          <w:sz w:val="24"/>
+          <w:szCs w:val="24"/>
+        </w:rPr>
+        <w:t>192.168.1.1</w:t>
       </w:r>
     </w:p>
     <w:sectPr>
@@ -808,7 +1088,7 @@
 </file>
 
 <file path=word/numbering.xml><?xml version="1.0" encoding="utf-8"?>
-<w:numbering xmlns:wpc="http://schemas.microsoft.com/office/word/2010/wordprocessingCanvas" xmlns:cx="http://schemas.microsoft.com/office/drawing/2014/chartex" xmlns:cx1="http://schemas.microsoft.com/office/drawing/2015/9/8/chartex" xmlns:cx2="http://schemas.microsoft.com/office/drawing/2015/10/21/chartex" xmlns:cx3="http://schemas.microsoft.com/office/drawing/2016/5/9/chartex" xmlns:cx4="http://schemas.microsoft.com/office/drawing/2016/5/10/chartex" xmlns:cx5="http://schemas.microsoft.com/office/drawing/2016/5/11/chartex" xmlns:cx6="http://schemas.microsoft.com/office/drawing/2016/5/12/chartex" xmlns:cx7="http://schemas.microsoft.com/office/drawing/2016/5/13/chartex" xmlns:cx8="http://schemas.microsoft.com/office/drawing/2016/5/14/chartex" xmlns:mc="http://schemas.openxmlformats.org/markup-compatibility/2006" xmlns:aink="http://schemas.microsoft.com/office/drawing/2016/ink" xmlns:am3d="http://schemas.microsoft.com/office/drawing/2017/model3d" xmlns:o="urn:schemas-microsoft-com:office:office" xmlns:oel="http://schemas.microsoft.com/office/2019/extlst" xmlns:r="http://schemas.openxmlformats.org/officeDocument/2006/relationships" xmlns:m="http://schemas.openxmlformats.org/officeDocument/2006/math" xmlns:v="urn:schemas-microsoft-com:vml" xmlns:wp14="http://schemas.microsoft.com/office/word/2010/wordprocessingDrawing" xmlns:wp="http://schemas.openxmlformats.org/drawingml/2006/wordprocessingDrawing" xmlns:w10="urn:schemas-microsoft-com:office:word" xmlns:w="http://schemas.openxmlformats.org/wordprocessingml/2006/main" xmlns:w14="http://schemas.microsoft.com/office/word/2010/wordml" xmlns:w15="http://schemas.microsoft.com/office/word/2012/wordml" xmlns:w16cex="http://schemas.microsoft.com/office/word/2018/wordml/cex" xmlns:w16cid="http://schemas.microsoft.com/office/word/2016/wordml/cid" xmlns:w16="http://schemas.microsoft.com/office/word/2018/wordml" xmlns:w16du="http://schemas.microsoft.com/office/word/2023/wordml/word16du" xmlns:w16sdtdh="http://schemas.microsoft.com/office/word/2020/wordml/sdtdatahash" xmlns:w16sdtfl="http://schemas.microsoft.com/office/word/2024/wordml/sdtformatlock" xmlns:w16se="http://schemas.microsoft.com/office/word/2015/wordml/symex" xmlns:wpg="http://schemas.microsoft.com/office/word/2010/wordprocessingGroup" xmlns:wpi="http://schemas.microsoft.com/office/word/2010/wordprocessingInk" xmlns:wne="http://schemas.microsoft.com/office/word/2006/wordml" xmlns:wps="http://schemas.microsoft.com/office/word/2010/wordprocessingShape" mc:Ignorable="w14 w15 w16se w16cid w16 w16cex w16sdtdh w16sdtfl w16du wp14">
+<w:numbering xmlns:wpc="http://schemas.microsoft.com/office/word/2010/wordprocessingCanvas" xmlns:cx="http://schemas.microsoft.com/office/drawing/2014/chartex" xmlns:cx1="http://schemas.microsoft.com/office/drawing/2015/9/8/chartex" xmlns:cx2="http://schemas.microsoft.com/office/drawing/2015/10/21/chartex" xmlns:cx3="http://schemas.microsoft.com/office/drawing/2016/5/9/chartex" xmlns:cx4="http://schemas.microsoft.com/office/drawing/2016/5/10/chartex" xmlns:cx5="http://schemas.microsoft.com/office/drawing/2016/5/11/chartex" xmlns:cx6="http://schemas.microsoft.com/office/drawing/2016/5/12/chartex" xmlns:cx7="http://schemas.microsoft.com/office/drawing/2016/5/13/chartex" xmlns:cx8="http://schemas.microsoft.com/office/drawing/2016/5/14/chartex" xmlns:mc="http://schemas.openxmlformats.org/markup-compatibility/2006" xmlns:aink="http://schemas.microsoft.com/office/drawing/2016/ink" xmlns:am3d="http://schemas.microsoft.com/office/drawing/2017/model3d" xmlns:o="urn:schemas-microsoft-com:office:office" xmlns:oel="http://schemas.microsoft.com/office/2019/extlst" xmlns:r="http://schemas.openxmlformats.org/officeDocument/2006/relationships" xmlns:m="http://schemas.openxmlformats.org/officeDocument/2006/math" xmlns:v="urn:schemas-microsoft-com:vml" xmlns:wp14="http://schemas.microsoft.com/office/word/2010/wordprocessingDrawing" xmlns:wp="http://schemas.openxmlformats.org/drawingml/2006/wordprocessingDrawing" xmlns:w10="urn:schemas-microsoft-com:office:word" xmlns:w="http://schemas.openxmlformats.org/wordprocessingml/2006/main" xmlns:w14="http://schemas.microsoft.com/office/word/2010/wordml" xmlns:w15="http://schemas.microsoft.com/office/word/2012/wordml" xmlns:w16cei="http://schemas.microsoft.com/office/word/2026/wordml/cei" xmlns:w16cex="http://schemas.microsoft.com/office/word/2018/wordml/cex" xmlns:w16cid="http://schemas.microsoft.com/office/word/2016/wordml/cid" xmlns:w16="http://schemas.microsoft.com/office/word/2018/wordml" xmlns:w16du="http://schemas.microsoft.com/office/word/2023/wordml/word16du" xmlns:w16sdtdh="http://schemas.microsoft.com/office/word/2020/wordml/sdtdatahash" xmlns:w16sdtfl="http://schemas.microsoft.com/office/word/2024/wordml/sdtformatlock" xmlns:w16se="http://schemas.microsoft.com/office/word/2015/wordml/symex" xmlns:wpg="http://schemas.microsoft.com/office/word/2010/wordprocessingGroup" xmlns:wpi="http://schemas.microsoft.com/office/word/2010/wordprocessingInk" xmlns:wne="http://schemas.microsoft.com/office/word/2006/wordml" xmlns:wps="http://schemas.microsoft.com/office/word/2010/wordprocessingShape" mc:Ignorable="w14 w15 w16se w16cid w16 w16cex w16sdtdh w16sdtfl w16du wp14">
   <w:abstractNum w:abstractNumId="0" w15:restartNumberingAfterBreak="0">
     <w:nsid w:val="02B16E42"/>
     <w:multiLevelType w:val="hybridMultilevel"/>
@@ -1092,7 +1372,7 @@
         <w:rFonts w:hint="default"/>
       </w:rPr>
     </w:lvl>
-    <w:lvl w:ilvl="1" w:tplc="04090019" w:tentative="1">
+    <w:lvl w:ilvl="1" w:tplc="04090019">
       <w:start w:val="1"/>
       <w:numFmt w:val="lowerLetter"/>
       <w:lvlText w:val="%2."/>
@@ -1279,7 +1559,7 @@
         <w:ind w:left="1440" w:hanging="360"/>
       </w:pPr>
     </w:lvl>
-    <w:lvl w:ilvl="2" w:tplc="0409001B" w:tentative="1">
+    <w:lvl w:ilvl="2" w:tplc="0409001B">
       <w:start w:val="1"/>
       <w:numFmt w:val="lowerRoman"/>
       <w:lvlText w:val="%3."/>
@@ -2330,7 +2610,6 @@
   <w:style w:type="character" w:default="1" w:styleId="DefaultParagraphFont">
     <w:name w:val="Default Paragraph Font"/>
     <w:uiPriority w:val="1"/>
-    <w:semiHidden/>
     <w:unhideWhenUsed/>
   </w:style>
   <w:style w:type="table" w:default="1" w:styleId="TableNormal">

</xml_diff>